<commit_message>
Apply composite title descriptors to Envision Horizons resume
Retrofits the newly codified title-framing policy: Solenzo, Level Agency,
Fetch & Funnel, and Wix now lead with a marketing-function descriptor ahead
of the real, unmodified title. Birdeye left plain since its bullets are
partner/CS work, not marketing execution, so a marketing descriptor there
wouldn't pass the two-minute defensibility test. Match report updated to
explain the change and note it softens but doesn't remove the founder/
entry-level seniority mismatch flagged in the score.

Co-Authored-By: Claude Sonnet 5 <noreply@anthropic.com>
Claude-Session: https://claude.ai/code/session_0156MEhwL9EVvjBp5E6Zjrpv
</commit_message>
<xml_diff>
--- a/applications/envision-horizons-marketing-specialist/resume.docx
+++ b/applications/envision-horizons-marketing-specialist/resume.docx
@@ -117,7 +117,7 @@
           <w:color w:val="1A1A1A"/>
           <w:sz w:val="21"/>
         </w:rPr>
-        <w:t>Founder &amp; Strategic / Marketing Operations Lead</w:t>
+        <w:t>Marketing &amp; Content Specialist - Founder &amp; Strategic / Marketing Operations Lead</w:t>
       </w:r>
       <w:r>
         <w:rPr>
@@ -291,7 +291,7 @@
           <w:color w:val="1A1A1A"/>
           <w:sz w:val="21"/>
         </w:rPr>
-        <w:t>Account Executive / Client Strategist</w:t>
+        <w:t>Marketing &amp; Campaign Execution - Account Executive / Client Strategist</w:t>
       </w:r>
       <w:r>
         <w:rPr>
@@ -519,7 +519,7 @@
           <w:color w:val="1A1A1A"/>
           <w:sz w:val="21"/>
         </w:rPr>
-        <w:t>Account Executive / Sales Operations</w:t>
+        <w:t>Marketing &amp; Campaign Operations - Account Executive / Sales Operations</w:t>
       </w:r>
       <w:r>
         <w:rPr>
@@ -621,7 +621,7 @@
           <w:color w:val="1A1A1A"/>
           <w:sz w:val="21"/>
         </w:rPr>
-        <w:t>Account Manager, Onboarding Launch Specialist &amp; Team Lead</w:t>
+        <w:t>Digital Marketing &amp; Growth - Account Manager, Onboarding Launch Specialist &amp; Team Lead</w:t>
       </w:r>
       <w:r>
         <w:rPr>

</xml_diff>